<commit_message>
Compiled the project and deployed in the web server
</commit_message>
<xml_diff>
--- a/Documentation/Technical Specifications/KEN Deployment Procedures.docx
+++ b/Documentation/Technical Specifications/KEN Deployment Procedures.docx
@@ -77,6 +77,373 @@
           <w:numId w:val="1"/>
         </w:numPr>
       </w:pPr>
+      <w:r>
+        <w:t>Compile the solution set configuration mode to Release</w:t>
+      </w:r>
+    </w:p>
+    <w:p>
+      <w:pPr>
+        <w:pStyle w:val="ListParagraph"/>
+        <w:numPr>
+          <w:ilvl w:val="0"/>
+          <w:numId w:val="1"/>
+        </w:numPr>
+      </w:pPr>
+      <w:r>
+        <w:t xml:space="preserve">Publish </w:t>
+      </w:r>
+      <w:proofErr w:type="spellStart"/>
+      <w:r>
+        <w:t>KenHrApp.Web</w:t>
+      </w:r>
+      <w:proofErr w:type="spellEnd"/>
+      <w:r>
+        <w:t xml:space="preserve"> project</w:t>
+      </w:r>
+    </w:p>
+    <w:p>
+      <w:pPr>
+        <w:pStyle w:val="ListParagraph"/>
+        <w:numPr>
+          <w:ilvl w:val="0"/>
+          <w:numId w:val="1"/>
+        </w:numPr>
+      </w:pPr>
+      <w:r>
+        <w:t xml:space="preserve">Backup the </w:t>
+      </w:r>
+      <w:proofErr w:type="spellStart"/>
+      <w:r>
+        <w:t>KenHr</w:t>
+      </w:r>
+      <w:proofErr w:type="spellEnd"/>
+      <w:r>
+        <w:t xml:space="preserve"> folder under the </w:t>
+      </w:r>
+      <w:proofErr w:type="spellStart"/>
+      <w:r>
+        <w:t>inetpub</w:t>
+      </w:r>
+      <w:proofErr w:type="spellEnd"/>
+      <w:r>
+        <w:t xml:space="preserve"> directory from the web server</w:t>
+      </w:r>
+    </w:p>
+    <w:p>
+      <w:pPr>
+        <w:pStyle w:val="ListParagraph"/>
+        <w:numPr>
+          <w:ilvl w:val="0"/>
+          <w:numId w:val="1"/>
+        </w:numPr>
+      </w:pPr>
+      <w:r>
+        <w:t>Copy the published files and put it</w:t>
+      </w:r>
+      <w:r>
+        <w:t xml:space="preserve"> the following folder on the web server: </w:t>
+      </w:r>
+    </w:p>
+    <w:p>
+      <w:pPr>
+        <w:ind w:left="720"/>
+      </w:pPr>
+      <w:r>
+        <w:t>C:\KenHr</w:t>
+      </w:r>
+    </w:p>
+    <w:p>
+      <w:pPr>
+        <w:pStyle w:val="ListParagraph"/>
+        <w:numPr>
+          <w:ilvl w:val="0"/>
+          <w:numId w:val="1"/>
+        </w:numPr>
+      </w:pPr>
+      <w:r>
+        <w:t xml:space="preserve">Go to IIS to stop the </w:t>
+      </w:r>
+      <w:proofErr w:type="spellStart"/>
+      <w:r>
+        <w:t>KenHr</w:t>
+      </w:r>
+      <w:proofErr w:type="spellEnd"/>
+      <w:r>
+        <w:t xml:space="preserve"> website and </w:t>
+      </w:r>
+      <w:proofErr w:type="spellStart"/>
+      <w:r>
+        <w:t>KenHrAppPool</w:t>
+      </w:r>
+      <w:proofErr w:type="spellEnd"/>
+      <w:r>
+        <w:t xml:space="preserve"> application pool</w:t>
+      </w:r>
+    </w:p>
+    <w:p>
+      <w:pPr>
+        <w:pStyle w:val="ListParagraph"/>
+        <w:numPr>
+          <w:ilvl w:val="0"/>
+          <w:numId w:val="1"/>
+        </w:numPr>
+      </w:pPr>
+      <w:r>
+        <w:t xml:space="preserve">Copy the </w:t>
+      </w:r>
+      <w:r>
+        <w:t xml:space="preserve">deployment </w:t>
+      </w:r>
+      <w:r>
+        <w:t>files</w:t>
+      </w:r>
+      <w:r>
+        <w:t xml:space="preserve"> from </w:t>
+      </w:r>
+      <w:r>
+        <w:t>C:\KenHr</w:t>
+      </w:r>
+      <w:r>
+        <w:t xml:space="preserve"> </w:t>
+      </w:r>
+      <w:r>
+        <w:t xml:space="preserve">to </w:t>
+      </w:r>
+      <w:proofErr w:type="spellStart"/>
+      <w:r>
+        <w:t>KenHR</w:t>
+      </w:r>
+      <w:proofErr w:type="spellEnd"/>
+      <w:r>
+        <w:t xml:space="preserve"> folder under the </w:t>
+      </w:r>
+      <w:proofErr w:type="spellStart"/>
+      <w:r>
+        <w:t>inetpub</w:t>
+      </w:r>
+      <w:proofErr w:type="spellEnd"/>
+      <w:r>
+        <w:t xml:space="preserve"> directory replacing all files except the following:</w:t>
+      </w:r>
+    </w:p>
+    <w:p>
+      <w:pPr>
+        <w:pStyle w:val="ListParagraph"/>
+        <w:numPr>
+          <w:ilvl w:val="1"/>
+          <w:numId w:val="1"/>
+        </w:numPr>
+      </w:pPr>
+      <w:proofErr w:type="spellStart"/>
+      <w:r>
+        <w:t>web.config</w:t>
+      </w:r>
+      <w:proofErr w:type="spellEnd"/>
+    </w:p>
+    <w:p>
+      <w:pPr>
+        <w:pStyle w:val="ListParagraph"/>
+        <w:numPr>
+          <w:ilvl w:val="1"/>
+          <w:numId w:val="1"/>
+        </w:numPr>
+      </w:pPr>
+      <w:proofErr w:type="spellStart"/>
+      <w:proofErr w:type="gramStart"/>
+      <w:r>
+        <w:t>KenHRApp.Web.runtimeconfig</w:t>
+      </w:r>
+      <w:proofErr w:type="gramEnd"/>
+      <w:r>
+        <w:t>.json</w:t>
+      </w:r>
+      <w:proofErr w:type="spellEnd"/>
+    </w:p>
+    <w:p>
+      <w:pPr>
+        <w:pStyle w:val="ListParagraph"/>
+        <w:numPr>
+          <w:ilvl w:val="1"/>
+          <w:numId w:val="1"/>
+        </w:numPr>
+      </w:pPr>
+      <w:proofErr w:type="spellStart"/>
+      <w:proofErr w:type="gramStart"/>
+      <w:r>
+        <w:t>KenHRApp.Web.deps</w:t>
+      </w:r>
+      <w:proofErr w:type="gramEnd"/>
+      <w:r>
+        <w:t>.json</w:t>
+      </w:r>
+      <w:proofErr w:type="spellEnd"/>
+    </w:p>
+    <w:p>
+      <w:pPr>
+        <w:pStyle w:val="ListParagraph"/>
+        <w:numPr>
+          <w:ilvl w:val="1"/>
+          <w:numId w:val="1"/>
+        </w:numPr>
+      </w:pPr>
+      <w:proofErr w:type="spellStart"/>
+      <w:proofErr w:type="gramStart"/>
+      <w:r>
+        <w:t>appsettings.production</w:t>
+      </w:r>
+      <w:proofErr w:type="gramEnd"/>
+      <w:r>
+        <w:t>.json</w:t>
+      </w:r>
+      <w:proofErr w:type="spellEnd"/>
+    </w:p>
+    <w:p>
+      <w:pPr>
+        <w:pStyle w:val="ListParagraph"/>
+        <w:numPr>
+          <w:ilvl w:val="1"/>
+          <w:numId w:val="1"/>
+        </w:numPr>
+      </w:pPr>
+      <w:proofErr w:type="spellStart"/>
+      <w:proofErr w:type="gramStart"/>
+      <w:r>
+        <w:t>appsettings.json</w:t>
+      </w:r>
+      <w:proofErr w:type="spellEnd"/>
+      <w:proofErr w:type="gramEnd"/>
+    </w:p>
+    <w:p>
+      <w:pPr>
+        <w:pStyle w:val="ListParagraph"/>
+        <w:numPr>
+          <w:ilvl w:val="1"/>
+          <w:numId w:val="1"/>
+        </w:numPr>
+      </w:pPr>
+      <w:proofErr w:type="spellStart"/>
+      <w:proofErr w:type="gramStart"/>
+      <w:r>
+        <w:t>appsettings.Development.json</w:t>
+      </w:r>
+      <w:proofErr w:type="spellEnd"/>
+      <w:proofErr w:type="gramEnd"/>
+    </w:p>
+    <w:p>
+      <w:pPr>
+        <w:pStyle w:val="ListParagraph"/>
+        <w:numPr>
+          <w:ilvl w:val="0"/>
+          <w:numId w:val="1"/>
+        </w:numPr>
+      </w:pPr>
+      <w:r>
+        <w:t xml:space="preserve">Go to the following folder in the development machine: </w:t>
+      </w:r>
+      <w:r>
+        <w:t>C:\NET Projects\KEN Solutions\</w:t>
+      </w:r>
+      <w:proofErr w:type="spellStart"/>
+      <w:r>
+        <w:t>DB_Backup</w:t>
+      </w:r>
+      <w:proofErr w:type="spellEnd"/>
+    </w:p>
+    <w:p>
+      <w:pPr>
+        <w:pStyle w:val="ListParagraph"/>
+        <w:numPr>
+          <w:ilvl w:val="0"/>
+          <w:numId w:val="1"/>
+        </w:numPr>
+      </w:pPr>
+      <w:r>
+        <w:t>Rename the “</w:t>
+      </w:r>
+      <w:proofErr w:type="spellStart"/>
+      <w:r>
+        <w:t>KenHrDb.bak</w:t>
+      </w:r>
+      <w:proofErr w:type="spellEnd"/>
+      <w:r>
+        <w:t xml:space="preserve">” file to </w:t>
+      </w:r>
+      <w:proofErr w:type="spellStart"/>
+      <w:r>
+        <w:t>KenHrDB_CurrentDate.bak</w:t>
+      </w:r>
+      <w:proofErr w:type="spellEnd"/>
+    </w:p>
+    <w:p>
+      <w:pPr>
+        <w:pStyle w:val="ListParagraph"/>
+        <w:numPr>
+          <w:ilvl w:val="0"/>
+          <w:numId w:val="1"/>
+        </w:numPr>
+      </w:pPr>
+      <w:r>
+        <w:t xml:space="preserve">Go to SQL Management Studio to create the backup of </w:t>
+      </w:r>
+      <w:proofErr w:type="spellStart"/>
+      <w:r>
+        <w:t>KenHrDb</w:t>
+      </w:r>
+      <w:proofErr w:type="spellEnd"/>
+      <w:r>
+        <w:t xml:space="preserve"> using the following file name: </w:t>
+      </w:r>
+      <w:proofErr w:type="spellStart"/>
+      <w:r>
+        <w:t>KenHrDb.bak</w:t>
+      </w:r>
+      <w:proofErr w:type="spellEnd"/>
+    </w:p>
+    <w:p/>
+    <w:p>
+      <w:pPr>
+        <w:rPr>
+          <w:b/>
+          <w:bCs/>
+          <w:color w:val="EE0000"/>
+          <w:u w:val="single"/>
+        </w:rPr>
+      </w:pPr>
+      <w:r>
+        <w:rPr>
+          <w:b/>
+          <w:bCs/>
+          <w:color w:val="EE0000"/>
+          <w:u w:val="single"/>
+        </w:rPr>
+        <w:t>Errors:</w:t>
+      </w:r>
+    </w:p>
+    <w:p>
+      <w:r>
+        <w:t>Tell me how to fix the below error message when running my HRMS Blazor server app on the web server:</w:t>
+      </w:r>
+    </w:p>
+    <w:p>
+      <w:r>
+        <w:t>An exception has been raised that is likely due to a transient failure. Consider enabling transient error resiliency by adding '</w:t>
+      </w:r>
+      <w:proofErr w:type="spellStart"/>
+      <w:r>
+        <w:t>EnableRetryOnFailure</w:t>
+      </w:r>
+      <w:proofErr w:type="spellEnd"/>
+      <w:r>
+        <w:t>' to the '</w:t>
+      </w:r>
+      <w:proofErr w:type="spellStart"/>
+      <w:r>
+        <w:t>UseSqlServer</w:t>
+      </w:r>
+      <w:proofErr w:type="spellEnd"/>
+      <w:r>
+        <w:t>' call.</w:t>
+      </w:r>
     </w:p>
     <w:sectPr>
       <w:pgSz w:w="11906" w:h="16838"/>
@@ -93,7 +460,7 @@
   <w:abstractNum w:abstractNumId="0" w15:restartNumberingAfterBreak="0">
     <w:nsid w:val="7CB04052"/>
     <w:multiLevelType w:val="hybridMultilevel"/>
-    <w:tmpl w:val="4E625686"/>
+    <w:tmpl w:val="F63C1124"/>
     <w:lvl w:ilvl="0" w:tplc="0809000F">
       <w:start w:val="1"/>
       <w:numFmt w:val="decimal"/>
@@ -103,14 +470,17 @@
         <w:ind w:left="360" w:hanging="360"/>
       </w:pPr>
     </w:lvl>
-    <w:lvl w:ilvl="1" w:tplc="08090019">
+    <w:lvl w:ilvl="1" w:tplc="08090001">
       <w:start w:val="1"/>
-      <w:numFmt w:val="lowerLetter"/>
-      <w:lvlText w:val="%2."/>
+      <w:numFmt w:val="bullet"/>
+      <w:lvlText w:val=""/>
       <w:lvlJc w:val="left"/>
       <w:pPr>
         <w:ind w:left="1080" w:hanging="360"/>
       </w:pPr>
+      <w:rPr>
+        <w:rFonts w:ascii="Symbol" w:hAnsi="Symbol" w:hint="default"/>
+      </w:rPr>
     </w:lvl>
     <w:lvl w:ilvl="2" w:tplc="0809001B" w:tentative="1">
       <w:start w:val="1"/>
@@ -785,7 +1155,6 @@
   <w:style w:type="character" w:default="1" w:styleId="DefaultParagraphFont">
     <w:name w:val="Default Paragraph Font"/>
     <w:uiPriority w:val="1"/>
-    <w:semiHidden/>
     <w:unhideWhenUsed/>
   </w:style>
   <w:style w:type="table" w:default="1" w:styleId="TableNormal">

</xml_diff>

<commit_message>
Compiled and deployed the system in production.
</commit_message>
<xml_diff>
--- a/Documentation/Technical Specifications/KEN Deployment Procedures.docx
+++ b/Documentation/Technical Specifications/KEN Deployment Procedures.docx
@@ -90,15 +90,7 @@
         </w:numPr>
       </w:pPr>
       <w:r>
-        <w:t xml:space="preserve">Publish </w:t>
-      </w:r>
-      <w:proofErr w:type="spellStart"/>
-      <w:r>
-        <w:t>KenHrApp.Web</w:t>
-      </w:r>
-      <w:proofErr w:type="spellEnd"/>
-      <w:r>
-        <w:t xml:space="preserve"> project</w:t>
+        <w:t>Publish KenHrApp.Web project</w:t>
       </w:r>
     </w:p>
     <w:p>
@@ -110,23 +102,7 @@
         </w:numPr>
       </w:pPr>
       <w:r>
-        <w:t xml:space="preserve">Backup the </w:t>
-      </w:r>
-      <w:proofErr w:type="spellStart"/>
-      <w:r>
-        <w:t>KenHr</w:t>
-      </w:r>
-      <w:proofErr w:type="spellEnd"/>
-      <w:r>
-        <w:t xml:space="preserve"> folder under the </w:t>
-      </w:r>
-      <w:proofErr w:type="spellStart"/>
-      <w:r>
-        <w:t>inetpub</w:t>
-      </w:r>
-      <w:proofErr w:type="spellEnd"/>
-      <w:r>
-        <w:t xml:space="preserve"> directory from the web server</w:t>
+        <w:t>Backup the KenHr folder under the inetpub directory from the web server</w:t>
       </w:r>
     </w:p>
     <w:p>
@@ -138,10 +114,7 @@
         </w:numPr>
       </w:pPr>
       <w:r>
-        <w:t>Copy the published files and put it</w:t>
-      </w:r>
-      <w:r>
-        <w:t xml:space="preserve"> the following folder on the web server: </w:t>
+        <w:t xml:space="preserve">Copy the published files and put it the following folder on the web server: </w:t>
       </w:r>
     </w:p>
     <w:p>
@@ -150,6 +123,9 @@
       </w:pPr>
       <w:r>
         <w:t>C:\KenHr</w:t>
+      </w:r>
+      <w:r>
+        <w:t>\Publish</w:t>
       </w:r>
     </w:p>
     <w:p>
@@ -161,23 +137,7 @@
         </w:numPr>
       </w:pPr>
       <w:r>
-        <w:t xml:space="preserve">Go to IIS to stop the </w:t>
-      </w:r>
-      <w:proofErr w:type="spellStart"/>
-      <w:r>
-        <w:t>KenHr</w:t>
-      </w:r>
-      <w:proofErr w:type="spellEnd"/>
-      <w:r>
-        <w:t xml:space="preserve"> website and </w:t>
-      </w:r>
-      <w:proofErr w:type="spellStart"/>
-      <w:r>
-        <w:t>KenHrAppPool</w:t>
-      </w:r>
-      <w:proofErr w:type="spellEnd"/>
-      <w:r>
-        <w:t xml:space="preserve"> application pool</w:t>
+        <w:t>Go to IIS to stop the KenHr website and KenHrAppPool application pool</w:t>
       </w:r>
     </w:p>
     <w:p>
@@ -209,21 +169,8 @@
       <w:r>
         <w:t xml:space="preserve">to </w:t>
       </w:r>
-      <w:proofErr w:type="spellStart"/>
-      <w:r>
-        <w:t>KenHR</w:t>
-      </w:r>
-      <w:proofErr w:type="spellEnd"/>
-      <w:r>
-        <w:t xml:space="preserve"> folder under the </w:t>
-      </w:r>
-      <w:proofErr w:type="spellStart"/>
-      <w:r>
-        <w:t>inetpub</w:t>
-      </w:r>
-      <w:proofErr w:type="spellEnd"/>
-      <w:r>
-        <w:t xml:space="preserve"> directory replacing all files except the following:</w:t>
+      <w:r>
+        <w:t>KenHR folder under the inetpub directory replacing all files except the following:</w:t>
       </w:r>
     </w:p>
     <w:p>
@@ -234,11 +181,9 @@
           <w:numId w:val="1"/>
         </w:numPr>
       </w:pPr>
-      <w:proofErr w:type="spellStart"/>
       <w:r>
         <w:t>web.config</w:t>
       </w:r>
-      <w:proofErr w:type="spellEnd"/>
     </w:p>
     <w:p>
       <w:pPr>
@@ -248,16 +193,9 @@
           <w:numId w:val="1"/>
         </w:numPr>
       </w:pPr>
-      <w:proofErr w:type="spellStart"/>
-      <w:proofErr w:type="gramStart"/>
-      <w:r>
-        <w:t>KenHRApp.Web.runtimeconfig</w:t>
-      </w:r>
-      <w:proofErr w:type="gramEnd"/>
-      <w:r>
-        <w:t>.json</w:t>
-      </w:r>
-      <w:proofErr w:type="spellEnd"/>
+      <w:r>
+        <w:t>KenHRApp.Web.runtimeconfig.json</w:t>
+      </w:r>
     </w:p>
     <w:p>
       <w:pPr>
@@ -267,16 +205,9 @@
           <w:numId w:val="1"/>
         </w:numPr>
       </w:pPr>
-      <w:proofErr w:type="spellStart"/>
-      <w:proofErr w:type="gramStart"/>
-      <w:r>
-        <w:t>KenHRApp.Web.deps</w:t>
-      </w:r>
-      <w:proofErr w:type="gramEnd"/>
-      <w:r>
-        <w:t>.json</w:t>
-      </w:r>
-      <w:proofErr w:type="spellEnd"/>
+      <w:r>
+        <w:t>KenHRApp.Web.deps.json</w:t>
+      </w:r>
     </w:p>
     <w:p>
       <w:pPr>
@@ -286,16 +217,9 @@
           <w:numId w:val="1"/>
         </w:numPr>
       </w:pPr>
-      <w:proofErr w:type="spellStart"/>
-      <w:proofErr w:type="gramStart"/>
-      <w:r>
-        <w:t>appsettings.production</w:t>
-      </w:r>
-      <w:proofErr w:type="gramEnd"/>
-      <w:r>
-        <w:t>.json</w:t>
-      </w:r>
-      <w:proofErr w:type="spellEnd"/>
+      <w:r>
+        <w:t>appsettings.production.json</w:t>
+      </w:r>
     </w:p>
     <w:p>
       <w:pPr>
@@ -305,13 +229,9 @@
           <w:numId w:val="1"/>
         </w:numPr>
       </w:pPr>
-      <w:proofErr w:type="spellStart"/>
-      <w:proofErr w:type="gramStart"/>
       <w:r>
         <w:t>appsettings.json</w:t>
       </w:r>
-      <w:proofErr w:type="spellEnd"/>
-      <w:proofErr w:type="gramEnd"/>
     </w:p>
     <w:p>
       <w:pPr>
@@ -321,13 +241,9 @@
           <w:numId w:val="1"/>
         </w:numPr>
       </w:pPr>
-      <w:proofErr w:type="spellStart"/>
-      <w:proofErr w:type="gramStart"/>
       <w:r>
         <w:t>appsettings.Development.json</w:t>
       </w:r>
-      <w:proofErr w:type="spellEnd"/>
-      <w:proofErr w:type="gramEnd"/>
     </w:p>
     <w:p>
       <w:pPr>
@@ -341,13 +257,8 @@
         <w:t xml:space="preserve">Go to the following folder in the development machine: </w:t>
       </w:r>
       <w:r>
-        <w:t>C:\NET Projects\KEN Solutions\</w:t>
-      </w:r>
-      <w:proofErr w:type="spellStart"/>
-      <w:r>
-        <w:t>DB_Backup</w:t>
-      </w:r>
-      <w:proofErr w:type="spellEnd"/>
+        <w:t>C:\NET Projects\KEN Solutions\DB_Backup</w:t>
+      </w:r>
     </w:p>
     <w:p>
       <w:pPr>
@@ -360,19 +271,12 @@
       <w:r>
         <w:t>Rename the “</w:t>
       </w:r>
-      <w:proofErr w:type="spellStart"/>
       <w:r>
         <w:t>KenHrDb.bak</w:t>
       </w:r>
-      <w:proofErr w:type="spellEnd"/>
-      <w:r>
-        <w:t xml:space="preserve">” file to </w:t>
-      </w:r>
-      <w:proofErr w:type="spellStart"/>
-      <w:r>
-        <w:t>KenHrDB_CurrentDate.bak</w:t>
-      </w:r>
-      <w:proofErr w:type="spellEnd"/>
+      <w:r>
+        <w:t>” file to KenHrDB_CurrentDate.bak</w:t>
+      </w:r>
     </w:p>
     <w:p>
       <w:pPr>
@@ -383,22 +287,171 @@
         </w:numPr>
       </w:pPr>
       <w:r>
-        <w:t xml:space="preserve">Go to SQL Management Studio to create the backup of </w:t>
-      </w:r>
-      <w:proofErr w:type="spellStart"/>
-      <w:r>
-        <w:t>KenHrDb</w:t>
-      </w:r>
-      <w:proofErr w:type="spellEnd"/>
-      <w:r>
-        <w:t xml:space="preserve"> using the following file name: </w:t>
-      </w:r>
-      <w:proofErr w:type="spellStart"/>
-      <w:r>
-        <w:t>KenHrDb.bak</w:t>
-      </w:r>
-      <w:proofErr w:type="spellEnd"/>
-    </w:p>
+        <w:t>Go to SQL Management Studio to create the backup of KenHrDb using the following file name: KenHrDb.bak</w:t>
+      </w:r>
+    </w:p>
+    <w:p>
+      <w:r>
+        <w:t>Deployment History:</w:t>
+      </w:r>
+    </w:p>
+    <w:tbl>
+      <w:tblPr>
+        <w:tblStyle w:val="GridTable4-Accent1"/>
+        <w:tblW w:w="0" w:type="auto"/>
+        <w:tblLook w:val="04A0" w:firstRow="1" w:lastRow="0" w:firstColumn="1" w:lastColumn="0" w:noHBand="0" w:noVBand="1"/>
+      </w:tblPr>
+      <w:tblGrid>
+        <w:gridCol w:w="1980"/>
+        <w:gridCol w:w="2410"/>
+        <w:gridCol w:w="2623"/>
+        <w:gridCol w:w="2003"/>
+      </w:tblGrid>
+      <w:tr>
+        <w:trPr>
+          <w:cnfStyle w:val="100000000000" w:firstRow="1" w:lastRow="0" w:firstColumn="0" w:lastColumn="0" w:oddVBand="0" w:evenVBand="0" w:oddHBand="0" w:evenHBand="0" w:firstRowFirstColumn="0" w:firstRowLastColumn="0" w:lastRowFirstColumn="0" w:lastRowLastColumn="0"/>
+        </w:trPr>
+        <w:tc>
+          <w:tcPr>
+            <w:cnfStyle w:val="001000000000" w:firstRow="0" w:lastRow="0" w:firstColumn="1" w:lastColumn="0" w:oddVBand="0" w:evenVBand="0" w:oddHBand="0" w:evenHBand="0" w:firstRowFirstColumn="0" w:firstRowLastColumn="0" w:lastRowFirstColumn="0" w:lastRowLastColumn="0"/>
+            <w:tcW w:w="1980" w:type="dxa"/>
+          </w:tcPr>
+          <w:p>
+            <w:r>
+              <w:t>Published Date</w:t>
+            </w:r>
+          </w:p>
+        </w:tc>
+        <w:tc>
+          <w:tcPr>
+            <w:tcW w:w="2410" w:type="dxa"/>
+          </w:tcPr>
+          <w:p>
+            <w:pPr>
+              <w:cnfStyle w:val="100000000000" w:firstRow="1" w:lastRow="0" w:firstColumn="0" w:lastColumn="0" w:oddVBand="0" w:evenVBand="0" w:oddHBand="0" w:evenHBand="0" w:firstRowFirstColumn="0" w:firstRowLastColumn="0" w:lastRowFirstColumn="0" w:lastRowLastColumn="0"/>
+            </w:pPr>
+            <w:r>
+              <w:t>Deployment Date</w:t>
+            </w:r>
+          </w:p>
+        </w:tc>
+        <w:tc>
+          <w:tcPr>
+            <w:tcW w:w="2623" w:type="dxa"/>
+          </w:tcPr>
+          <w:p>
+            <w:pPr>
+              <w:cnfStyle w:val="100000000000" w:firstRow="1" w:lastRow="0" w:firstColumn="0" w:lastColumn="0" w:oddVBand="0" w:evenVBand="0" w:oddHBand="0" w:evenHBand="0" w:firstRowFirstColumn="0" w:firstRowLastColumn="0" w:lastRowFirstColumn="0" w:lastRowLastColumn="0"/>
+            </w:pPr>
+            <w:r>
+              <w:t>Last DB Update Date</w:t>
+            </w:r>
+          </w:p>
+        </w:tc>
+        <w:tc>
+          <w:tcPr>
+            <w:tcW w:w="2003" w:type="dxa"/>
+          </w:tcPr>
+          <w:p>
+            <w:pPr>
+              <w:cnfStyle w:val="100000000000" w:firstRow="1" w:lastRow="0" w:firstColumn="0" w:lastColumn="0" w:oddVBand="0" w:evenVBand="0" w:oddHBand="0" w:evenHBand="0" w:firstRowFirstColumn="0" w:firstRowLastColumn="0" w:lastRowFirstColumn="0" w:lastRowLastColumn="0"/>
+            </w:pPr>
+            <w:r>
+              <w:t>Status</w:t>
+            </w:r>
+          </w:p>
+        </w:tc>
+      </w:tr>
+      <w:tr>
+        <w:trPr>
+          <w:cnfStyle w:val="000000100000" w:firstRow="0" w:lastRow="0" w:firstColumn="0" w:lastColumn="0" w:oddVBand="0" w:evenVBand="0" w:oddHBand="1" w:evenHBand="0" w:firstRowFirstColumn="0" w:firstRowLastColumn="0" w:lastRowFirstColumn="0" w:lastRowLastColumn="0"/>
+        </w:trPr>
+        <w:tc>
+          <w:tcPr>
+            <w:cnfStyle w:val="001000000000" w:firstRow="0" w:lastRow="0" w:firstColumn="1" w:lastColumn="0" w:oddVBand="0" w:evenVBand="0" w:oddHBand="0" w:evenHBand="0" w:firstRowFirstColumn="0" w:firstRowLastColumn="0" w:lastRowFirstColumn="0" w:lastRowLastColumn="0"/>
+            <w:tcW w:w="1980" w:type="dxa"/>
+          </w:tcPr>
+          <w:p>
+            <w:r>
+              <w:t>11-Jul-2026</w:t>
+            </w:r>
+          </w:p>
+        </w:tc>
+        <w:tc>
+          <w:tcPr>
+            <w:tcW w:w="2410" w:type="dxa"/>
+          </w:tcPr>
+          <w:p>
+            <w:pPr>
+              <w:cnfStyle w:val="000000100000" w:firstRow="0" w:lastRow="0" w:firstColumn="0" w:lastColumn="0" w:oddVBand="0" w:evenVBand="0" w:oddHBand="1" w:evenHBand="0" w:firstRowFirstColumn="0" w:firstRowLastColumn="0" w:lastRowFirstColumn="0" w:lastRowLastColumn="0"/>
+            </w:pPr>
+            <w:r>
+              <w:t>11-Jul-2026</w:t>
+            </w:r>
+          </w:p>
+        </w:tc>
+        <w:tc>
+          <w:tcPr>
+            <w:tcW w:w="2623" w:type="dxa"/>
+          </w:tcPr>
+          <w:p>
+            <w:pPr>
+              <w:cnfStyle w:val="000000100000" w:firstRow="0" w:lastRow="0" w:firstColumn="0" w:lastColumn="0" w:oddVBand="0" w:evenVBand="0" w:oddHBand="1" w:evenHBand="0" w:firstRowFirstColumn="0" w:firstRowLastColumn="0" w:lastRowFirstColumn="0" w:lastRowLastColumn="0"/>
+            </w:pPr>
+          </w:p>
+        </w:tc>
+        <w:tc>
+          <w:tcPr>
+            <w:tcW w:w="2003" w:type="dxa"/>
+          </w:tcPr>
+          <w:p>
+            <w:pPr>
+              <w:cnfStyle w:val="000000100000" w:firstRow="0" w:lastRow="0" w:firstColumn="0" w:lastColumn="0" w:oddVBand="0" w:evenVBand="0" w:oddHBand="1" w:evenHBand="0" w:firstRowFirstColumn="0" w:firstRowLastColumn="0" w:lastRowFirstColumn="0" w:lastRowLastColumn="0"/>
+            </w:pPr>
+          </w:p>
+        </w:tc>
+      </w:tr>
+      <w:tr>
+        <w:tc>
+          <w:tcPr>
+            <w:cnfStyle w:val="001000000000" w:firstRow="0" w:lastRow="0" w:firstColumn="1" w:lastColumn="0" w:oddVBand="0" w:evenVBand="0" w:oddHBand="0" w:evenHBand="0" w:firstRowFirstColumn="0" w:firstRowLastColumn="0" w:lastRowFirstColumn="0" w:lastRowLastColumn="0"/>
+            <w:tcW w:w="1980" w:type="dxa"/>
+          </w:tcPr>
+          <w:p/>
+        </w:tc>
+        <w:tc>
+          <w:tcPr>
+            <w:tcW w:w="2410" w:type="dxa"/>
+          </w:tcPr>
+          <w:p>
+            <w:pPr>
+              <w:cnfStyle w:val="000000000000" w:firstRow="0" w:lastRow="0" w:firstColumn="0" w:lastColumn="0" w:oddVBand="0" w:evenVBand="0" w:oddHBand="0" w:evenHBand="0" w:firstRowFirstColumn="0" w:firstRowLastColumn="0" w:lastRowFirstColumn="0" w:lastRowLastColumn="0"/>
+            </w:pPr>
+          </w:p>
+        </w:tc>
+        <w:tc>
+          <w:tcPr>
+            <w:tcW w:w="2623" w:type="dxa"/>
+          </w:tcPr>
+          <w:p>
+            <w:pPr>
+              <w:cnfStyle w:val="000000000000" w:firstRow="0" w:lastRow="0" w:firstColumn="0" w:lastColumn="0" w:oddVBand="0" w:evenVBand="0" w:oddHBand="0" w:evenHBand="0" w:firstRowFirstColumn="0" w:firstRowLastColumn="0" w:lastRowFirstColumn="0" w:lastRowLastColumn="0"/>
+            </w:pPr>
+          </w:p>
+        </w:tc>
+        <w:tc>
+          <w:tcPr>
+            <w:tcW w:w="2003" w:type="dxa"/>
+          </w:tcPr>
+          <w:p>
+            <w:pPr>
+              <w:cnfStyle w:val="000000000000" w:firstRow="0" w:lastRow="0" w:firstColumn="0" w:lastColumn="0" w:oddVBand="0" w:evenVBand="0" w:oddHBand="0" w:evenHBand="0" w:firstRowFirstColumn="0" w:firstRowLastColumn="0" w:lastRowFirstColumn="0" w:lastRowLastColumn="0"/>
+            </w:pPr>
+          </w:p>
+        </w:tc>
+      </w:tr>
+    </w:tbl>
+    <w:p/>
     <w:p/>
     <w:p>
       <w:pPr>
@@ -426,23 +479,7 @@
     </w:p>
     <w:p>
       <w:r>
-        <w:t>An exception has been raised that is likely due to a transient failure. Consider enabling transient error resiliency by adding '</w:t>
-      </w:r>
-      <w:proofErr w:type="spellStart"/>
-      <w:r>
-        <w:t>EnableRetryOnFailure</w:t>
-      </w:r>
-      <w:proofErr w:type="spellEnd"/>
-      <w:r>
-        <w:t>' to the '</w:t>
-      </w:r>
-      <w:proofErr w:type="spellStart"/>
-      <w:r>
-        <w:t>UseSqlServer</w:t>
-      </w:r>
-      <w:proofErr w:type="spellEnd"/>
-      <w:r>
-        <w:t>' call.</w:t>
+        <w:t>An exception has been raised that is likely due to a transient failure. Consider enabling transient error resiliency by adding 'EnableRetryOnFailure' to the 'UseSqlServer' call.</w:t>
       </w:r>
     </w:p>
     <w:sectPr>
@@ -1155,6 +1192,7 @@
   <w:style w:type="character" w:default="1" w:styleId="DefaultParagraphFont">
     <w:name w:val="Default Paragraph Font"/>
     <w:uiPriority w:val="1"/>
+    <w:semiHidden/>
     <w:unhideWhenUsed/>
   </w:style>
   <w:style w:type="table" w:default="1" w:styleId="TableNormal">
@@ -1467,6 +1505,101 @@
       <w:color w:val="0F4761" w:themeColor="accent1" w:themeShade="BF"/>
       <w:spacing w:val="5"/>
     </w:rPr>
+  </w:style>
+  <w:style w:type="table" w:styleId="TableGrid">
+    <w:name w:val="Table Grid"/>
+    <w:basedOn w:val="TableNormal"/>
+    <w:uiPriority w:val="39"/>
+    <w:rsid w:val="0058447C"/>
+    <w:pPr>
+      <w:spacing w:after="0" w:line="240" w:lineRule="auto"/>
+    </w:pPr>
+    <w:tblPr>
+      <w:tblBorders>
+        <w:top w:val="single" w:sz="4" w:space="0" w:color="auto"/>
+        <w:left w:val="single" w:sz="4" w:space="0" w:color="auto"/>
+        <w:bottom w:val="single" w:sz="4" w:space="0" w:color="auto"/>
+        <w:right w:val="single" w:sz="4" w:space="0" w:color="auto"/>
+        <w:insideH w:val="single" w:sz="4" w:space="0" w:color="auto"/>
+        <w:insideV w:val="single" w:sz="4" w:space="0" w:color="auto"/>
+      </w:tblBorders>
+    </w:tblPr>
+  </w:style>
+  <w:style w:type="table" w:styleId="GridTable4-Accent1">
+    <w:name w:val="Grid Table 4 Accent 1"/>
+    <w:basedOn w:val="TableNormal"/>
+    <w:uiPriority w:val="49"/>
+    <w:rsid w:val="0058447C"/>
+    <w:pPr>
+      <w:spacing w:after="0" w:line="240" w:lineRule="auto"/>
+    </w:pPr>
+    <w:tblPr>
+      <w:tblStyleRowBandSize w:val="1"/>
+      <w:tblStyleColBandSize w:val="1"/>
+      <w:tblBorders>
+        <w:top w:val="single" w:sz="4" w:space="0" w:color="45B0E1" w:themeColor="accent1" w:themeTint="99"/>
+        <w:left w:val="single" w:sz="4" w:space="0" w:color="45B0E1" w:themeColor="accent1" w:themeTint="99"/>
+        <w:bottom w:val="single" w:sz="4" w:space="0" w:color="45B0E1" w:themeColor="accent1" w:themeTint="99"/>
+        <w:right w:val="single" w:sz="4" w:space="0" w:color="45B0E1" w:themeColor="accent1" w:themeTint="99"/>
+        <w:insideH w:val="single" w:sz="4" w:space="0" w:color="45B0E1" w:themeColor="accent1" w:themeTint="99"/>
+        <w:insideV w:val="single" w:sz="4" w:space="0" w:color="45B0E1" w:themeColor="accent1" w:themeTint="99"/>
+      </w:tblBorders>
+    </w:tblPr>
+    <w:tblStylePr w:type="firstRow">
+      <w:rPr>
+        <w:b/>
+        <w:bCs/>
+        <w:color w:val="FFFFFF" w:themeColor="background1"/>
+      </w:rPr>
+      <w:tblPr/>
+      <w:tcPr>
+        <w:tcBorders>
+          <w:top w:val="single" w:sz="4" w:space="0" w:color="156082" w:themeColor="accent1"/>
+          <w:left w:val="single" w:sz="4" w:space="0" w:color="156082" w:themeColor="accent1"/>
+          <w:bottom w:val="single" w:sz="4" w:space="0" w:color="156082" w:themeColor="accent1"/>
+          <w:right w:val="single" w:sz="4" w:space="0" w:color="156082" w:themeColor="accent1"/>
+          <w:insideH w:val="nil"/>
+          <w:insideV w:val="nil"/>
+        </w:tcBorders>
+        <w:shd w:val="clear" w:color="auto" w:fill="156082" w:themeFill="accent1"/>
+      </w:tcPr>
+    </w:tblStylePr>
+    <w:tblStylePr w:type="lastRow">
+      <w:rPr>
+        <w:b/>
+        <w:bCs/>
+      </w:rPr>
+      <w:tblPr/>
+      <w:tcPr>
+        <w:tcBorders>
+          <w:top w:val="double" w:sz="4" w:space="0" w:color="156082" w:themeColor="accent1"/>
+        </w:tcBorders>
+      </w:tcPr>
+    </w:tblStylePr>
+    <w:tblStylePr w:type="firstCol">
+      <w:rPr>
+        <w:b/>
+        <w:bCs/>
+      </w:rPr>
+    </w:tblStylePr>
+    <w:tblStylePr w:type="lastCol">
+      <w:rPr>
+        <w:b/>
+        <w:bCs/>
+      </w:rPr>
+    </w:tblStylePr>
+    <w:tblStylePr w:type="band1Vert">
+      <w:tblPr/>
+      <w:tcPr>
+        <w:shd w:val="clear" w:color="auto" w:fill="C1E4F5" w:themeFill="accent1" w:themeFillTint="33"/>
+      </w:tcPr>
+    </w:tblStylePr>
+    <w:tblStylePr w:type="band1Horz">
+      <w:tblPr/>
+      <w:tcPr>
+        <w:shd w:val="clear" w:color="auto" w:fill="C1E4F5" w:themeFill="accent1" w:themeFillTint="33"/>
+      </w:tcPr>
+    </w:tblStylePr>
   </w:style>
 </w:styles>
 </file>

</xml_diff>